<commit_message>
Final report: team names on the first page
</commit_message>
<xml_diff>
--- a/docs/Final_Report_Bankruptcy_Prediction.docx
+++ b/docs/Final_Report_Bankruptcy_Prediction.docx
@@ -120,6 +120,71 @@
                 <w:szCs w:val="19"/>
               </w:rPr>
               <w:t xml:space="preserve">Natural Language Processing and Deep Learning (third-year project)</w:t>
+            </w:r>
+          </w:p>
+        </w:tc>
+      </w:tr>
+      <w:tr>
+        <w:trPr>
+          <w:cantSplit/>
+        </w:trPr>
+        <w:tc>
+          <w:tcPr>
+            <w:tcW w:type="dxa" w:w="1861"/>
+            <w:tcBorders>
+              <w:top w:val="single" w:color="BFBFBF" w:sz="4"/>
+              <w:left w:val="single" w:color="BFBFBF" w:sz="4"/>
+              <w:bottom w:val="single" w:color="BFBFBF" w:sz="4"/>
+              <w:right w:val="single" w:color="BFBFBF" w:sz="4"/>
+            </w:tcBorders>
+            <w:tcMar>
+              <w:top w:type="dxa" w:w="50"/>
+              <w:left w:type="dxa" w:w="90"/>
+              <w:bottom w:type="dxa" w:w="50"/>
+              <w:right w:type="dxa" w:w="90"/>
+            </w:tcMar>
+          </w:tcPr>
+          <w:p>
+            <w:pPr>
+              <w:spacing w:after="0" w:line="252"/>
+              <w:jc w:val="left"/>
+            </w:pPr>
+            <w:r>
+              <w:rPr>
+                <w:sz w:val="19"/>
+                <w:szCs w:val="19"/>
+              </w:rPr>
+              <w:t xml:space="preserve">Team</w:t>
+            </w:r>
+          </w:p>
+        </w:tc>
+        <w:tc>
+          <w:tcPr>
+            <w:tcW w:type="dxa" w:w="7445"/>
+            <w:tcBorders>
+              <w:top w:val="single" w:color="BFBFBF" w:sz="4"/>
+              <w:left w:val="single" w:color="BFBFBF" w:sz="4"/>
+              <w:bottom w:val="single" w:color="BFBFBF" w:sz="4"/>
+              <w:right w:val="single" w:color="BFBFBF" w:sz="4"/>
+            </w:tcBorders>
+            <w:tcMar>
+              <w:top w:type="dxa" w:w="50"/>
+              <w:left w:type="dxa" w:w="90"/>
+              <w:bottom w:type="dxa" w:w="50"/>
+              <w:right w:type="dxa" w:w="90"/>
+            </w:tcMar>
+          </w:tcPr>
+          <w:p>
+            <w:pPr>
+              <w:spacing w:after="0" w:line="252"/>
+              <w:jc w:val="left"/>
+            </w:pPr>
+            <w:r>
+              <w:rPr>
+                <w:sz w:val="19"/>
+                <w:szCs w:val="19"/>
+              </w:rPr>
+              <w:t xml:space="preserve">Kartik Agrawal (I001), Ananya Baweja (I003)</w:t>
             </w:r>
           </w:p>
         </w:tc>

</xml_diff>